<commit_message>
docs: update report with proper Portuguese accents
</commit_message>
<xml_diff>
--- a/docs/relatorio.docx
+++ b/docs/relatorio.docx
@@ -15,7 +15,7 @@
           <w:color w:val="00467F"/>
           <w:sz w:val="32"/>
         </w:rPr>
-        <w:t>ATIVIDADE PRATICA DE DEPENDENCIA</w:t>
+        <w:t>ATIVIDADE PRÁTICA DE DEPENDÊNCIA</w:t>
       </w:r>
     </w:p>
     <w:p>
@@ -46,7 +46,7 @@
           <w:color w:val="505050"/>
           <w:sz w:val="22"/>
         </w:rPr>
-        <w:t>Pipeline GitOps para provisionamento, validacao e entrega de infraestrutura imutavel</w:t>
+        <w:t>Pipeline GitOps para provisionamento, validação e entrega de infraestrutura imutável</w:t>
       </w:r>
     </w:p>
     <w:p>
@@ -70,7 +70,7 @@
           <w:i w:val="0"/>
           <w:sz w:val="24"/>
         </w:rPr>
-        <w:t>Edmario Santos</w:t>
+        <w:t>Edmário Santos</w:t>
       </w:r>
     </w:p>
     <w:p>
@@ -178,7 +178,7 @@
           <w:i w:val="0"/>
           <w:sz w:val="22"/>
         </w:rPr>
-        <w:t>Este trabalho implementou uma esteira GitOps completa sobre infraestrutura AWS, cobrindo provisionamento, entrega continua e reconciliacao declarativa. A solucao utiliza Terraform para provisionar VPC, cluster EKS e repositorio ECR em dois ambientes independentes (dev e prd), controlados pelas branches develop e main. Um pipeline de CI/CD no GitHub Actions valida, testa e publica automaticamente a aplicacao Node.js containerizada, atualizando os manifestos Kubernetes via Kustomize. O ArgoCD monitora o repositorio Git e sincroniza o estado declarado para o cluster EKS de forma automatica, garantindo reconciliacao continua e deteccao de drift. Foram implementadas branch protection rules que bloqueiam merges em caso de falha nos checks de CI, demonstrando governanca do fluxo de mudanca. Experimentos de rollback via interface do ArgoCD e de destruicao de infraestrutura via pipeline automatizado completam a cobertura dos requisitos da atividade.</w:t>
+        <w:t>Este trabalho implementou uma esteira GitOps completa sobre infraestrutura AWS, cobrindo provisionamento, entrega contínua e reconciliação declarativa. A solução utiliza Terraform para provisionar VPC, cluster EKS e repositório ECR em dois ambientes independentes (dev e prd), controlados pelas branches develop e main. Um pipeline de CI/CD no GitHub Actions valida, testa e publica automaticamente a aplicação Node.js containerizada, atualizando os manifestos Kubernetes via Kustomize. O ArgoCD monitora o repositório Git e sincroniza o estado declarado para o cluster EKS de forma automática, garantindo reconciliação contínua e detecção de drift. Foram implementadas branch protection rules que bloqueiam merges em caso de falha nos checks de CI, demonstrando governança do fluxo de mudança. Experimentos de rollback via interface do ArgoCD e de destruição de infraestrutura via pipeline automatizado completam a cobertura dos requisitos da atividade.</w:t>
       </w:r>
     </w:p>
     <w:p>
@@ -199,7 +199,7 @@
           <w:color w:val="00467F"/>
           <w:sz w:val="28"/>
         </w:rPr>
-        <w:t>2. Arquitetura e Decisoes Tecnicas</w:t>
+        <w:t>2. Arquitetura e Decisões Técnicas</w:t>
       </w:r>
     </w:p>
     <w:p>
@@ -215,7 +215,7 @@
           <w:color w:val="00467F"/>
           <w:sz w:val="24"/>
         </w:rPr>
-        <w:t>2.1 Visao Geral do Fluxo GitOps</w:t>
+        <w:t>2.1 Visão Geral do Fluxo GitOps</w:t>
       </w:r>
     </w:p>
     <w:p>
@@ -230,7 +230,7 @@
           <w:i w:val="0"/>
           <w:sz w:val="22"/>
         </w:rPr>
-        <w:t>O fluxo de entrega segue o modelo GitOps onde o repositorio Git e a fonte unica de verdade:</w:t>
+        <w:t>O fluxo de entrega segue o modelo GitOps onde o repositório Git é a fonte única de verdade:</w:t>
       </w:r>
     </w:p>
     <w:p>
@@ -245,7 +245,7 @@
           <w:i w:val="0"/>
           <w:sz w:val="22"/>
         </w:rPr>
-        <w:t>Desenvolvedor faz push ou abre Pull Request -&gt; dispara pipeline CI/CD no GitHub Actions</w:t>
+        <w:t>Desenvolvedor faz push ou abre Pull Request → dispara pipeline CI/CD no GitHub Actions</w:t>
       </w:r>
     </w:p>
     <w:p>
@@ -260,7 +260,7 @@
           <w:i w:val="0"/>
           <w:sz w:val="22"/>
         </w:rPr>
-        <w:t>CI: lint, testes unitarios, terraform validate/plan, tfsec (security scan)</w:t>
+        <w:t>CI: lint, testes unitários, terraform validate/plan, tfsec (security scan)</w:t>
       </w:r>
     </w:p>
     <w:p>
@@ -290,7 +290,7 @@
           <w:i w:val="0"/>
           <w:sz w:val="22"/>
         </w:rPr>
-        <w:t>Atualizacao automatica do kustomization.yaml com a nova tag via commit do bot [skip ci]</w:t>
+        <w:t>Atualização automática do kustomization.yaml com a nova tag via commit do bot [skip ci]</w:t>
       </w:r>
     </w:p>
     <w:p>
@@ -305,7 +305,7 @@
           <w:i w:val="0"/>
           <w:sz w:val="22"/>
         </w:rPr>
-        <w:t>ArgoCD detecta alteracao no repositorio e sincroniza o manifesto para o cluster EKS</w:t>
+        <w:t>ArgoCD detecta alteração no repositório e sincroniza o manifesto para o cluster EKS</w:t>
       </w:r>
     </w:p>
     <w:p>
@@ -320,7 +320,7 @@
           <w:i w:val="0"/>
           <w:sz w:val="22"/>
         </w:rPr>
-        <w:t>Aplicacao e atualizada no ambiente correspondente (dev ou prd) sem intervencao manual</w:t>
+        <w:t>Aplicação é atualizada no ambiente correspondente (dev ou prd) sem intervenção manual</w:t>
       </w:r>
     </w:p>
     <w:p>
@@ -360,7 +360,7 @@
           <w:i w:val="0"/>
           <w:sz w:val="22"/>
         </w:rPr>
-        <w:t>Provisionamento declarativo de infraestrutura AWS (VPC, EKS, ECR). Escolhido pela maturidade, suporte nativo a AWS e backend remoto com S3 + DynamoDB para controle de estado e lock.</w:t>
+        <w:t>Provisionamento declarativo de infraestrutura AWS (VPC, EKS, ECR). Escolhido pela maturidade, suporte nativo à AWS e backend remoto com S3 + DynamoDB para controle de estado e lock.</w:t>
       </w:r>
     </w:p>
     <w:p>
@@ -384,7 +384,7 @@
           <w:i w:val="0"/>
           <w:sz w:val="22"/>
         </w:rPr>
-        <w:t>Pipeline CI/CD nativo do repositorio, sem necessidade de servidor externo. Integracao direta com eventos de PR e push, path filters e branch protection.</w:t>
+        <w:t>Pipeline CI/CD nativo do repositório, sem necessidade de servidor externo. Integração direta com eventos de PR e push, path filters e branch protection.</w:t>
       </w:r>
     </w:p>
     <w:p>
@@ -408,7 +408,7 @@
           <w:i w:val="0"/>
           <w:sz w:val="22"/>
         </w:rPr>
-        <w:t>Kubernetes gerenciado na AWS. Elimina a gestao do control plane e integra nativamente com IAM, ECR e VPC.</w:t>
+        <w:t>Kubernetes gerenciado na AWS. Elimina a gestão do control plane e integra nativamente com IAM, ECR e VPC.</w:t>
       </w:r>
     </w:p>
     <w:p>
@@ -432,7 +432,7 @@
           <w:i w:val="0"/>
           <w:sz w:val="22"/>
         </w:rPr>
-        <w:t>Registry de imagens Docker privado na AWS. Integracao nativa com EKS via IAM, sem necessidade de credenciais adicionais nos pods.</w:t>
+        <w:t>Registry de imagens Docker privado na AWS. Integração nativa com EKS via IAM, sem necessidade de credenciais adicionais nos pods.</w:t>
       </w:r>
     </w:p>
     <w:p>
@@ -456,7 +456,7 @@
           <w:i w:val="0"/>
           <w:sz w:val="22"/>
         </w:rPr>
-        <w:t>Operador GitOps para Kubernetes. Monitora o repositorio Git e garante que o estado do cluster reflita o estado declarado, com reconciliacao automatica (selfHeal) e historico de deployments para rollback.</w:t>
+        <w:t>Operador GitOps para Kubernetes. Monitora o repositório Git e garante que o estado do cluster reflita o estado declarado, com reconciliação automática (selfHeal) e histórico de deployments para rollback.</w:t>
       </w:r>
     </w:p>
     <w:p>
@@ -480,7 +480,7 @@
           <w:i w:val="0"/>
           <w:sz w:val="22"/>
         </w:rPr>
-        <w:t>Gerenciamento de overlays por ambiente (dev/prd) sem duplicacao de manifestos base. Permite customizar imagens, replicas e variaveis por ambiente.</w:t>
+        <w:t>Gerenciamento de overlays por ambiente (dev/prd) sem duplicação de manifestos base. Permite customizar imagens, réplicas e variáveis por ambiente.</w:t>
       </w:r>
     </w:p>
     <w:p>
@@ -504,7 +504,7 @@
           <w:i w:val="0"/>
           <w:sz w:val="22"/>
         </w:rPr>
-        <w:t>Analise estatica de seguranca nos arquivos Terraform. Integrado ao pipeline de CI para detectar configuracoes inseguras antes do apply.</w:t>
+        <w:t>Análise estática de segurança nos arquivos Terraform. Integrado ao pipeline de CI para detectar configurações inseguras antes do apply.</w:t>
       </w:r>
     </w:p>
     <w:p>
@@ -535,7 +535,7 @@
           <w:i w:val="0"/>
           <w:sz w:val="22"/>
         </w:rPr>
-        <w:t>Foram criados dois ambientes logicos com separacao de estado e configuracao:</w:t>
+        <w:t>Foram criados dois ambientes lógicos com separação de estado e configuração:</w:t>
       </w:r>
     </w:p>
     <w:p>
@@ -550,7 +550,7 @@
           <w:i w:val="0"/>
           <w:sz w:val="22"/>
         </w:rPr>
-        <w:t>dev: branch develop -&gt; cluster EKS eks-rm565486-dev -&gt; overlay k8s/overlays/dev/</w:t>
+        <w:t>dev: branch develop → cluster EKS eks-rm565486-dev → overlay k8s/overlays/dev/</w:t>
       </w:r>
     </w:p>
     <w:p>
@@ -565,7 +565,7 @@
           <w:i w:val="0"/>
           <w:sz w:val="22"/>
         </w:rPr>
-        <w:t>prd: branch main -&gt; cluster EKS eks-rm565486-prd -&gt; overlay k8s/overlays/prd/</w:t>
+        <w:t>prd: branch main → cluster EKS eks-rm565486-prd → overlay k8s/overlays/prd/</w:t>
       </w:r>
     </w:p>
     <w:p>
@@ -586,7 +586,7 @@
           <w:color w:val="00467F"/>
           <w:sz w:val="28"/>
         </w:rPr>
-        <w:t>3. Passo a Passo de Implementacao</w:t>
+        <w:t>3. Passo a Passo de Implementação</w:t>
       </w:r>
     </w:p>
     <w:p>
@@ -602,7 +602,7 @@
           <w:color w:val="00467F"/>
           <w:sz w:val="24"/>
         </w:rPr>
-        <w:t>3.1 Estrutura do Repositorio</w:t>
+        <w:t>3.1 Estrutura do Repositório</w:t>
       </w:r>
     </w:p>
     <w:p>
@@ -653,7 +653,7 @@
           <w:color w:val="1E1E1E"/>
           <w:sz w:val="18"/>
         </w:rPr>
-        <w:t xml:space="preserve">      ci-cd-app.yaml       # Pipeline CI/CD da aplicacao</w:t>
+        <w:t xml:space="preserve">      ci-cd-app.yaml       # Pipeline CI/CD da aplicação</w:t>
       </w:r>
     </w:p>
     <w:p>
@@ -687,7 +687,7 @@
           <w:color w:val="1E1E1E"/>
           <w:sz w:val="18"/>
         </w:rPr>
-        <w:t xml:space="preserve">      terraform-destroy.yaml  # Workflow de destruicao manual</w:t>
+        <w:t xml:space="preserve">      terraform-destroy.yaml  # Workflow de destruição manual</w:t>
       </w:r>
     </w:p>
     <w:p>
@@ -704,7 +704,7 @@
           <w:color w:val="1E1E1E"/>
           <w:sz w:val="18"/>
         </w:rPr>
-        <w:t xml:space="preserve">   application/            # Codigo-fonte Node.js + Dockerfile</w:t>
+        <w:t xml:space="preserve">   application/            # Código-fonte Node.js + Dockerfile</w:t>
       </w:r>
     </w:p>
     <w:p>
@@ -789,7 +789,7 @@
           <w:color w:val="1E1E1E"/>
           <w:sz w:val="18"/>
         </w:rPr>
-        <w:t xml:space="preserve">      argocd/              # Definicao das apps ArgoCD</w:t>
+        <w:t xml:space="preserve">      argocd/              # Definição das apps ArgoCD</w:t>
       </w:r>
     </w:p>
     <w:p>
@@ -806,7 +806,7 @@
           <w:color w:val="1E1E1E"/>
           <w:sz w:val="18"/>
         </w:rPr>
-        <w:t xml:space="preserve">   terraform/              # Infraestrutura como codigo</w:t>
+        <w:t xml:space="preserve">   terraform/              # Infraestrutura como código</w:t>
       </w:r>
     </w:p>
     <w:p>
@@ -823,7 +823,7 @@
           <w:color w:val="1E1E1E"/>
           <w:sz w:val="18"/>
         </w:rPr>
-        <w:t xml:space="preserve">   docs/                   # Documentacao e diagrama</w:t>
+        <w:t xml:space="preserve">   docs/                   # Documentação e diagrama</w:t>
       </w:r>
     </w:p>
     <w:p>
@@ -854,7 +854,7 @@
           <w:i w:val="0"/>
           <w:sz w:val="22"/>
         </w:rPr>
-        <w:t>A infraestrutura e provisionada automaticamente via pipeline ao fazer push para develop (dev) ou main (prd). O workflow ci-cd-iac.yaml executa Terraform Apply com o backend de estado correto para cada ambiente:</w:t>
+        <w:t>A infraestrutura é provisionada automaticamente via pipeline ao fazer push para develop (dev) ou main (prd). O workflow ci-cd-iac.yaml executa Terraform Apply com o backend de estado correto para cada ambiente:</w:t>
       </w:r>
     </w:p>
     <w:p>
@@ -918,7 +918,7 @@
           <w:i w:val="0"/>
           <w:sz w:val="22"/>
         </w:rPr>
-        <w:t>VPC com subnets publicas e privadas em multiplas AZs</w:t>
+        <w:t>VPC com subnets públicas e privadas em múltiplas AZs</w:t>
       </w:r>
     </w:p>
     <w:p>
@@ -933,7 +933,7 @@
           <w:i w:val="0"/>
           <w:sz w:val="22"/>
         </w:rPr>
-        <w:t>Cluster EKS com node group gerenciado (instancia t3.medium)</w:t>
+        <w:t>Cluster EKS com node group gerenciado (instância t3.medium)</w:t>
       </w:r>
     </w:p>
     <w:p>
@@ -948,7 +948,7 @@
           <w:i w:val="0"/>
           <w:sz w:val="22"/>
         </w:rPr>
-        <w:t>Repositorio ECR para armazenar imagens Docker</w:t>
+        <w:t>Repositório ECR para armazenar imagens Docker</w:t>
       </w:r>
     </w:p>
     <w:p>
@@ -979,7 +979,7 @@
           <w:color w:val="00467F"/>
           <w:sz w:val="24"/>
         </w:rPr>
-        <w:t>3.3 Pipeline CI/CD da Aplicacao (ci-cd-app.yaml)</w:t>
+        <w:t>3.3 Pipeline CI/CD da Aplicação (ci-cd-app.yaml)</w:t>
       </w:r>
     </w:p>
     <w:p>
@@ -994,7 +994,7 @@
           <w:i w:val="0"/>
           <w:sz w:val="22"/>
         </w:rPr>
-        <w:t>Disparado por push ou PR nas branches main/develop com alteracoes em application/** ou no proprio arquivo de workflow. Separado em dois jobs:</w:t>
+        <w:t>Disparado por push ou PR nas branches main/develop com alterações em application/** ou no próprio arquivo de workflow. Separado em dois jobs:</w:t>
       </w:r>
     </w:p>
     <w:p>
@@ -1191,7 +1191,7 @@
           <w:i w:val="0"/>
           <w:sz w:val="22"/>
         </w:rPr>
-        <w:t>Disparado por push ou PR em terraform/** ou no proprio workflow.</w:t>
+        <w:t>Disparado por push ou PR em terraform/** ou no próprio workflow.</w:t>
       </w:r>
     </w:p>
     <w:p>
@@ -1327,7 +1327,7 @@
           <w:color w:val="00467F"/>
           <w:sz w:val="24"/>
         </w:rPr>
-        <w:t>3.5 Configuracao do ArgoCD</w:t>
+        <w:t>3.5 Configuração do ArgoCD</w:t>
       </w:r>
     </w:p>
     <w:p>
@@ -1342,7 +1342,7 @@
           <w:i w:val="0"/>
           <w:sz w:val="22"/>
         </w:rPr>
-        <w:t>O ArgoCD foi instalado via Terraform (Helm provider) e configurado com sincronizacao automatica e self-heal. Cada ambiente possui uma Application separada:</w:t>
+        <w:t>O ArgoCD foi instalado via Terraform (Helm provider) e configurado com sincronização automática e self-heal. Cada ambiente possui uma Application separada:</w:t>
       </w:r>
     </w:p>
     <w:p>
@@ -1529,7 +1529,7 @@
           <w:color w:val="1E1E1E"/>
           <w:sz w:val="18"/>
         </w:rPr>
-        <w:t xml:space="preserve">      selfHeal: true   # Reverte alteracoes manuais no cluster</w:t>
+        <w:t xml:space="preserve">      selfHeal: true   # Reverte alterações manuais no cluster</w:t>
       </w:r>
     </w:p>
     <w:p>
@@ -1560,7 +1560,7 @@
           <w:i w:val="0"/>
           <w:sz w:val="22"/>
         </w:rPr>
-        <w:t>Configuradas via GitHub API nas branches develop e main para exigir que o check "Lint &amp; Test" passe antes de qualquer merge. Bloqueia force push e delecao das branches protegidas.</w:t>
+        <w:t>Configuradas via GitHub API nas branches develop e main para exigir que o check "Lint &amp; Test" passe antes de qualquer merge. Bloqueia force push e exclusão das branches protegidas.</w:t>
       </w:r>
     </w:p>
     <w:p>
@@ -1597,7 +1597,7 @@
           <w:color w:val="00467F"/>
           <w:sz w:val="24"/>
         </w:rPr>
-        <w:t>4.1 Pipeline CI/CD com sucesso — PR #10 (feat/version-endpoint -&gt; develop)</w:t>
+        <w:t>4.1 Pipeline CI/CD com sucesso — PR #10 (feat/version-endpoint → develop)</w:t>
       </w:r>
     </w:p>
     <w:p>
@@ -1627,7 +1627,7 @@
           <w:i w:val="0"/>
           <w:sz w:val="22"/>
         </w:rPr>
-        <w:t>Resultado obtido: Lint &amp; Test concluido em 14s. Build, Push &amp; Deploy concluido em 29s. Imagem publicada no ECR com tag = SHA do commit. Kustomization.yaml atualizado automaticamente e ArgoCD sincronizado com o novo deployment.</w:t>
+        <w:t>Resultado obtido: Lint &amp; Test concluído em 14s. Build, Push &amp; Deploy concluído em 29s. Imagem publicada no ECR com tag = SHA do commit. kustomization.yaml atualizado automaticamente e ArgoCD sincronizado com o novo deployment.</w:t>
       </w:r>
     </w:p>
     <w:p>
@@ -1643,7 +1643,7 @@
           <w:color w:val="00467F"/>
           <w:sz w:val="24"/>
         </w:rPr>
-        <w:t>4.2 PR bloqueado por falha de CI — PR #9 (test/ci-block-evidence -&gt; develop)</w:t>
+        <w:t>4.2 PR bloqueado por falha de CI — PR #9 (test/ci-block-evidence → develop)</w:t>
       </w:r>
     </w:p>
     <w:p>
@@ -1673,7 +1673,7 @@
           <w:i w:val="0"/>
           <w:sz w:val="22"/>
         </w:rPr>
-        <w:t>Resultado obtido: CI falhou com AssertionError: "ok" !== "healthy" no teste GET /health. Branch protection rule impediu o merge com mensagem "Required status check Lint &amp; Test is failing". Botao "Merge pull request" desabilitado.</w:t>
+        <w:t>Resultado obtido: CI falhou com AssertionError: "ok" !== "healthy" no teste GET /health. Branch protection rule impediu o merge com mensagem "Required status check Lint &amp; Test is failing". Botão "Merge pull request" desabilitado.</w:t>
       </w:r>
     </w:p>
     <w:p>
@@ -1688,7 +1688,7 @@
           <w:i w:val="0"/>
           <w:sz w:val="22"/>
         </w:rPr>
-        <w:t>Analise: o bloqueio so passou a funcionar apos configuracao explicita das branch protection rules. O GitHub nao bloqueia merges automaticamente apenas por falha de CI — e necessaria a configuracao de required status checks na protecao da branch.</w:t>
+        <w:t>Análise: o bloqueio só passou a funcionar após configuração explícita das branch protection rules. O GitHub não bloqueia merges automaticamente apenas por falha de CI — é necessária a configuração de required status checks na proteção da branch.</w:t>
       </w:r>
     </w:p>
     <w:p>
@@ -1704,7 +1704,7 @@
           <w:color w:val="00467F"/>
           <w:sz w:val="24"/>
         </w:rPr>
-        <w:t>4.3 Drift e Reconciliacao Automatica (ArgoCD selfHeal)</w:t>
+        <w:t>4.3 Drift e Reconciliação Automática (ArgoCD selfHeal)</w:t>
       </w:r>
     </w:p>
     <w:p>
@@ -1719,7 +1719,7 @@
           <w:i w:val="0"/>
           <w:sz w:val="22"/>
         </w:rPr>
-        <w:t>Resultado esperado: ArgoCD detecta alteracao manual no cluster e reverte para o estado declarado no Git.</w:t>
+        <w:t>Resultado esperado: ArgoCD detecta alteração manual no cluster e reverte para o estado declarado no Git.</w:t>
       </w:r>
     </w:p>
     <w:p>
@@ -1734,7 +1734,7 @@
           <w:i w:val="0"/>
           <w:sz w:val="22"/>
         </w:rPr>
-        <w:t>Resultado obtido: Apos delecao manual de recurso via UI do ArgoCD, o app entrou em estado OutOfSync e foi automaticamente reconciliado para Synced em menos de 3 minutos, sem intervencao manual.</w:t>
+        <w:t>Resultado obtido: Após deleção manual de recurso via UI do ArgoCD, o app entrou em estado OutOfSync e foi automaticamente reconciliado para Synced em menos de 3 minutos, sem intervenção manual.</w:t>
       </w:r>
     </w:p>
     <w:p>
@@ -1765,7 +1765,7 @@
           <w:i w:val="0"/>
           <w:sz w:val="22"/>
         </w:rPr>
-        <w:t>Resultado esperado: ArgoCD permite reverter para versao anterior via historico de syncs.</w:t>
+        <w:t>Resultado esperado: ArgoCD permite reverter para versão anterior via histórico de syncs.</w:t>
       </w:r>
     </w:p>
     <w:p>
@@ -1780,7 +1780,7 @@
           <w:i w:val="0"/>
           <w:sz w:val="22"/>
         </w:rPr>
-        <w:t>Resultado obtido: Rollback executado via "History and Rollback" na UI do ArgoCD. App implantou versao anterior com sucesso. Com selfHeal ativo, o ArgoCD reconvergiu para o HEAD do repositorio automaticamente apos o rollback manual, demonstrando tanto o rollback quanto a reconciliacao declarativa.</w:t>
+        <w:t>Resultado obtido: Rollback executado via "History and Rollback" na UI do ArgoCD. App implantou versão anterior com sucesso. Com selfHeal ativo, o ArgoCD reconvergiu para o HEAD do repositório automaticamente após o rollback manual, demonstrando tanto o rollback quanto a reconciliação declarativa.</w:t>
       </w:r>
     </w:p>
     <w:p>
@@ -1796,7 +1796,7 @@
           <w:color w:val="00467F"/>
           <w:sz w:val="24"/>
         </w:rPr>
-        <w:t>4.5 Destruicao de Infraestrutura (terraform-destroy.yaml)</w:t>
+        <w:t>4.5 Destruição de Infraestrutura (terraform-destroy.yaml)</w:t>
       </w:r>
     </w:p>
     <w:p>
@@ -1826,7 +1826,7 @@
           <w:i w:val="0"/>
           <w:sz w:val="22"/>
         </w:rPr>
-        <w:t>Primeiro run falhou com erro "Error acquiring the state lock" — state lock travado por pipeline cancelado anteriormente (OperationTypePlan pendente no DynamoDB). Corrigido com adicao de step para deletar o item de lock no DynamoDB antes do destroy. Segunda execucao disparada com sucesso para ambos os ambientes em paralelo.</w:t>
+        <w:t>Primeiro run falhou com erro "Error acquiring the state lock" — state lock travado por pipeline cancelado anteriormente (OperationTypePlan pendente no DynamoDB). Corrigido com adição de step para deletar o item de lock no DynamoDB antes do destroy. Segunda execução disparada com sucesso para ambos os ambientes em paralelo.</w:t>
       </w:r>
     </w:p>
     <w:p>
@@ -1847,7 +1847,7 @@
           <w:color w:val="00467F"/>
           <w:sz w:val="28"/>
         </w:rPr>
-        <w:t>5. Inventario de Recursos e Instrucoes de Limpeza</w:t>
+        <w:t>5. Inventário de Recursos e Instruções de Limpeza</w:t>
       </w:r>
     </w:p>
     <w:p>
@@ -1907,7 +1907,7 @@
                 <w:i w:val="0"/>
                 <w:sz w:val="20"/>
               </w:rPr>
-              <w:t>Nome / Configuracao</w:t>
+              <w:t>Nome / Configuração</w:t>
             </w:r>
           </w:p>
         </w:tc>
@@ -1975,7 +1975,7 @@
                 <w:i w:val="0"/>
                 <w:sz w:val="20"/>
               </w:rPr>
-              <w:t>3 publicas + 3 privadas por VPC</w:t>
+              <w:t>3 públicas + 3 privadas por VPC</w:t>
             </w:r>
           </w:p>
         </w:tc>
@@ -2111,7 +2111,7 @@
                 <w:i w:val="0"/>
                 <w:sz w:val="20"/>
               </w:rPr>
-              <w:t>t3.medium, min:1 max:2 nos</w:t>
+              <w:t>t3.medium, mín: 1 / máx: 2 nós</w:t>
             </w:r>
           </w:p>
         </w:tc>
@@ -2262,7 +2262,7 @@
           <w:i w:val="0"/>
           <w:sz w:val="22"/>
         </w:rPr>
-        <w:t>Deployment: rm565486-app (1 replica por ambiente)</w:t>
+        <w:t>Deployment: rm565486-app (1 réplica por ambiente)</w:t>
       </w:r>
     </w:p>
     <w:p>
@@ -2323,7 +2323,7 @@
           <w:color w:val="00467F"/>
           <w:sz w:val="24"/>
         </w:rPr>
-        <w:t>5.3 Instrucoes de Destruicao</w:t>
+        <w:t>5.3 Instruções de Destruição</w:t>
       </w:r>
     </w:p>
     <w:p>
@@ -2338,7 +2338,7 @@
           <w:i w:val="0"/>
           <w:sz w:val="22"/>
         </w:rPr>
-        <w:t>A destruicao e realizada via workflow manual no GitHub Actions:</w:t>
+        <w:t>A destruição é realizada via workflow manual no GitHub Actions:</w:t>
       </w:r>
     </w:p>
     <w:p>
@@ -2353,7 +2353,7 @@
           <w:i w:val="0"/>
           <w:sz w:val="22"/>
         </w:rPr>
-        <w:t>Acessar o repositorio no GitHub -&gt; aba Actions</w:t>
+        <w:t>Acessar o repositório no GitHub → aba Actions</w:t>
       </w:r>
     </w:p>
     <w:p>
@@ -2398,7 +2398,7 @@
           <w:i w:val="0"/>
           <w:sz w:val="22"/>
         </w:rPr>
-        <w:t>Confirmar execucao — o workflow deleta o state lock pendente e executa terraform destroy -auto-approve</w:t>
+        <w:t>Confirmar execução — o workflow exclui o state lock pendente e executa terraform destroy -auto-approve</w:t>
       </w:r>
     </w:p>
     <w:p>
@@ -2434,7 +2434,7 @@
           <w:color w:val="00467F"/>
           <w:sz w:val="28"/>
         </w:rPr>
-        <w:t>6. Conclusao Tecnica</w:t>
+        <w:t>6. Conclusão Técnica</w:t>
       </w:r>
     </w:p>
     <w:p>
@@ -2450,7 +2450,7 @@
           <w:color w:val="00467F"/>
           <w:sz w:val="24"/>
         </w:rPr>
-        <w:t>6.1 Resultados Alcancados</w:t>
+        <w:t>6.1 Resultados Alcançados</w:t>
       </w:r>
     </w:p>
     <w:p>
@@ -2480,7 +2480,7 @@
           <w:i w:val="0"/>
           <w:sz w:val="22"/>
         </w:rPr>
-        <w:t>Separacao de responsabilidades entre pipeline de aplicacao e de infraestrutura</w:t>
+        <w:t>Separação de responsabilidades entre pipeline de aplicação e de infraestrutura</w:t>
       </w:r>
     </w:p>
     <w:p>
@@ -2495,7 +2495,7 @@
           <w:i w:val="0"/>
           <w:sz w:val="22"/>
         </w:rPr>
-        <w:t>Reconciliacao automatica via ArgoCD com selfHeal e prune ativos</w:t>
+        <w:t>Reconciliação automática via ArgoCD com selfHeal e prune ativos</w:t>
       </w:r>
     </w:p>
     <w:p>
@@ -2510,7 +2510,7 @@
           <w:i w:val="0"/>
           <w:sz w:val="22"/>
         </w:rPr>
-        <w:t>Governanca de mudancas com branch protection bloqueando merges com falha de CI</w:t>
+        <w:t>Governança de mudanças com branch protection bloqueando merges com falha de CI</w:t>
       </w:r>
     </w:p>
     <w:p>
@@ -2525,7 +2525,7 @@
           <w:i w:val="0"/>
           <w:sz w:val="22"/>
         </w:rPr>
-        <w:t>Rastreabilidade total: versao da imagem em producao reflete o SHA do commit no Git</w:t>
+        <w:t>Rastreabilidade total: versão da imagem em produção reflete o SHA do commit no Git</w:t>
       </w:r>
     </w:p>
     <w:p>
@@ -2540,7 +2540,7 @@
           <w:i w:val="0"/>
           <w:sz w:val="22"/>
         </w:rPr>
-        <w:t>Experimentos de drift, rollback e destruicao documentados com evidencias de execucao</w:t>
+        <w:t>Experimentos de drift, rollback e destruição documentados com evidências de execução</w:t>
       </w:r>
     </w:p>
     <w:p>
@@ -2556,7 +2556,7 @@
           <w:color w:val="00467F"/>
           <w:sz w:val="24"/>
         </w:rPr>
-        <w:t>6.2 Limitacoes</w:t>
+        <w:t>6.2 Limitações</w:t>
       </w:r>
     </w:p>
     <w:p>
@@ -2571,7 +2571,7 @@
           <w:i w:val="0"/>
           <w:sz w:val="22"/>
         </w:rPr>
-        <w:t>Cluster EKS sem Ingress Controller configurado — aplicacao nao possui acesso HTTP externo</w:t>
+        <w:t>Cluster EKS sem Ingress Controller configurado — aplicação não possui acesso HTTP externo</w:t>
       </w:r>
     </w:p>
     <w:p>
@@ -2586,7 +2586,7 @@
           <w:i w:val="0"/>
           <w:sz w:val="22"/>
         </w:rPr>
-        <w:t>tfsec configurado com soft_fail: true, nao bloqueando o pipeline em violacoes de seguranca</w:t>
+        <w:t>tfsec configurado com soft_fail: true, não bloqueando o pipeline em violações de segurança</w:t>
       </w:r>
     </w:p>
     <w:p>
@@ -2601,7 +2601,7 @@
           <w:i w:val="0"/>
           <w:sz w:val="22"/>
         </w:rPr>
-        <w:t>Nao ha ambiente de homologacao intermediario entre dev e prd</w:t>
+        <w:t>Não há ambiente de homologação intermediário entre dev e prd</w:t>
       </w:r>
     </w:p>
     <w:p>
@@ -2616,7 +2616,7 @@
           <w:i w:val="0"/>
           <w:sz w:val="22"/>
         </w:rPr>
-        <w:t>ArgoCD sem autenticacao SSO — apenas usuario admin local</w:t>
+        <w:t>ArgoCD sem autenticação SSO — apenas usuário admin local</w:t>
       </w:r>
     </w:p>
     <w:p>
@@ -2631,7 +2631,7 @@
           <w:i w:val="0"/>
           <w:sz w:val="22"/>
         </w:rPr>
-        <w:t>Credenciais AWS armazenadas como secrets estaticos no GitHub</w:t>
+        <w:t>Credenciais AWS armazenadas como secrets estáticos no GitHub</w:t>
       </w:r>
     </w:p>
     <w:p>
@@ -2692,7 +2692,7 @@
           <w:i w:val="0"/>
           <w:sz w:val="22"/>
         </w:rPr>
-        <w:t>Segredos AWS expostos em caso de comprometimento do repositorio GitHub</w:t>
+        <w:t>Segredos AWS expostos em caso de comprometimento do repositório GitHub</w:t>
       </w:r>
     </w:p>
     <w:p>
@@ -2723,7 +2723,7 @@
           <w:i w:val="0"/>
           <w:sz w:val="22"/>
         </w:rPr>
-        <w:t>Implementar IRSA (IAM Roles for Service Accounts) para eliminar credenciais estaticas</w:t>
+        <w:t>Implementar IRSA (IAM Roles for Service Accounts) para eliminar credenciais estáticas</w:t>
       </w:r>
     </w:p>
     <w:p>
@@ -2738,7 +2738,7 @@
           <w:i w:val="0"/>
           <w:sz w:val="22"/>
         </w:rPr>
-        <w:t>Adicionar Ingress Controller (AWS ALB) com certificado TLS para exposicao da aplicacao</w:t>
+        <w:t>Adicionar Ingress Controller (AWS ALB) com certificado TLS para exposição da aplicação</w:t>
       </w:r>
     </w:p>
     <w:p>
@@ -2798,7 +2798,7 @@
           <w:i w:val="0"/>
           <w:sz w:val="22"/>
         </w:rPr>
-        <w:t>Substituir workflow_dispatch do destroy por environment protection rules com aprovacao obrigatoria</w:t>
+        <w:t>Substituir workflow_dispatch do destroy por environment protection rules com aprovação obrigatória</w:t>
       </w:r>
     </w:p>
     <w:p>
@@ -2819,7 +2819,7 @@
           <w:color w:val="00467F"/>
           <w:sz w:val="28"/>
         </w:rPr>
-        <w:t>7. Referencias e Declaracao de Autoria</w:t>
+        <w:t>7. Referências e Declaração de Autoria</w:t>
       </w:r>
     </w:p>
     <w:p>
@@ -2835,7 +2835,7 @@
           <w:color w:val="00467F"/>
           <w:sz w:val="24"/>
         </w:rPr>
-        <w:t>7.1 Referencias</w:t>
+        <w:t>7.1 Referências</w:t>
       </w:r>
     </w:p>
     <w:p>
@@ -2947,7 +2947,7 @@
           <w:i w:val="0"/>
           <w:sz w:val="20"/>
         </w:rPr>
-        <w:t>[8] Repositorio da atividade. https://github.com/edmariosantos92/dp-gitops.fiap</w:t>
+        <w:t>[8] Repositório da atividade. https://github.com/edmariosantos92/dp-gitops.fiap</w:t>
       </w:r>
     </w:p>
     <w:p>
@@ -2963,7 +2963,7 @@
           <w:color w:val="00467F"/>
           <w:sz w:val="24"/>
         </w:rPr>
-        <w:t>7.2 Declaracao de Autoria</w:t>
+        <w:t>7.2 Declaração de Autoria</w:t>
       </w:r>
     </w:p>
     <w:p>
@@ -2978,7 +2978,7 @@
           <w:i w:val="0"/>
           <w:sz w:val="22"/>
         </w:rPr>
-        <w:t>Declaro que este trabalho foi desenvolvido integralmente por mim, Edmario Santos, aluno da turma 1TCNPZ, como parte da atividade pratica de dependencia da disciplina Infrastructure as Code (GitOps). Todo o codigo, configuracoes e documentacao presentes neste relatorio e no repositorio GitHub sao de minha autoria, com uso de ferramentas de inteligencia artificial como suporte a implementacao e documentacao.</w:t>
+        <w:t>Declaro que este trabalho foi desenvolvido integralmente por mim, Edmário Santos, aluno da turma 1TCNPZ, como parte da atividade prática de dependência da disciplina Infrastructure as Code (GitOps). Todo o código, configurações e documentação presentes neste relatório e no repositório GitHub são de minha autoria, com uso de ferramentas de inteligência artificial como suporte à implementação e documentação.</w:t>
       </w:r>
     </w:p>
     <w:p>
@@ -2993,7 +2993,7 @@
           <w:i w:val="0"/>
           <w:sz w:val="22"/>
         </w:rPr>
-        <w:t>Edmario Santos  |  1TCNPZ  |  19/06/2026</w:t>
+        <w:t>Edmário Santos  |  1TCNPZ  |  19/06/2026</w:t>
       </w:r>
     </w:p>
     <w:sectPr>

</xml_diff>

<commit_message>
docs: add video link to report
</commit_message>
<xml_diff>
--- a/docs/relatorio.docx
+++ b/docs/relatorio.docx
@@ -143,6 +143,30 @@
           <w:sz w:val="24"/>
         </w:rPr>
         <w:t>19/06/2026</w:t>
+      </w:r>
+    </w:p>
+    <w:p>
+      <w:pPr>
+        <w:spacing w:after="120"/>
+        <w:jc w:val="center"/>
+      </w:pPr>
+      <w:r>
+        <w:rPr>
+          <w:rFonts w:ascii="Arial" w:hAnsi="Arial"/>
+          <w:b/>
+          <w:i w:val="0"/>
+          <w:sz w:val="24"/>
+        </w:rPr>
+        <w:t xml:space="preserve">Vídeo: </w:t>
+      </w:r>
+      <w:r>
+        <w:rPr>
+          <w:rFonts w:ascii="Arial" w:hAnsi="Arial"/>
+          <w:b w:val="0"/>
+          <w:i w:val="0"/>
+          <w:sz w:val="24"/>
+        </w:rPr>
+        <w:t>https://diascarneiro-my.sharepoint.com/:f:/g/personal/esa_diascarneiro_com_br/IgBUmfHRiNnfRY5v3KeHWZe2AaOo-7deahO0BH5daWNzrjI?e=IoLelf</w:t>
       </w:r>
     </w:p>
     <w:p>
@@ -2952,6 +2976,20 @@
     </w:p>
     <w:p>
       <w:pPr>
+        <w:spacing w:after="60"/>
+      </w:pPr>
+      <w:r>
+        <w:rPr>
+          <w:rFonts w:ascii="Arial" w:hAnsi="Arial"/>
+          <w:b w:val="0"/>
+          <w:i w:val="0"/>
+          <w:sz w:val="20"/>
+        </w:rPr>
+        <w:t>[9] Vídeo de demonstração. https://diascarneiro-my.sharepoint.com/:f:/g/personal/esa_diascarneiro_com_br/IgBUmfHRiNnfRY5v3KeHWZe2AaOo-7deahO0BH5daWNzrjI?e=IoLelf</w:t>
+      </w:r>
+    </w:p>
+    <w:p>
+      <w:pPr>
         <w:spacing w:before="200" w:after="120"/>
         <w:jc w:val="left"/>
       </w:pPr>

</xml_diff>